<commit_message>
feat: implement contract management with a new controller and services for document number generation and export.
</commit_message>
<xml_diff>
--- a/Template_Kontrak.docx
+++ b/Template_Kontrak.docx
@@ -272,44 +272,10 @@
       </w:pPr>
       <w:r>
         <w:rPr>
-          <w:spacing w:val="-2"/>
-          <w:sz w:val="20"/>
-          <w:szCs w:val="20"/>
-        </w:rPr>
-        <w:fldChar w:fldCharType="begin"/>
-      </w:r>
-      <w:r>
-        <w:rPr>
-          <w:spacing w:val="-2"/>
-          <w:sz w:val="20"/>
-          <w:szCs w:val="20"/>
-        </w:rPr>
-        <w:instrText xml:space="preserve"> MERGEFIELD Penyedia </w:instrText>
-      </w:r>
-      <w:r>
-        <w:rPr>
-          <w:spacing w:val="-2"/>
-          <w:sz w:val="20"/>
-          <w:szCs w:val="20"/>
-        </w:rPr>
-        <w:fldChar w:fldCharType="separate"/>
-      </w:r>
-      <w:r>
-        <w:rPr>
-          <w:noProof/>
-          <w:spacing w:val="-2"/>
-          <w:sz w:val="20"/>
-          <w:szCs w:val="20"/>
-        </w:rPr>
-        <w:t>«Penyedia»</w:t>
-      </w:r>
-      <w:r>
-        <w:rPr>
-          <w:spacing w:val="-2"/>
-          <w:sz w:val="20"/>
-          <w:szCs w:val="20"/>
-        </w:rPr>
-        <w:fldChar w:fldCharType="end"/>
+          <w:sz w:val="20"/>
+          <w:szCs w:val="20"/>
+        </w:rPr>
+        <w:t>${nama_penyedia}</w:t>
       </w:r>
     </w:p>
     <w:p>
@@ -350,43 +316,13 @@
           <w:sz w:val="20"/>
           <w:szCs w:val="20"/>
         </w:rPr>
-        <w:fldChar w:fldCharType="begin"/>
-      </w:r>
-      <w:r>
-        <w:rPr>
-          <w:sz w:val="20"/>
-          <w:szCs w:val="20"/>
-        </w:rPr>
-        <w:instrText xml:space="preserve"> MERGEFIELD Kota </w:instrText>
-      </w:r>
-      <w:r>
-        <w:rPr>
-          <w:sz w:val="20"/>
-          <w:szCs w:val="20"/>
-        </w:rPr>
-        <w:fldChar w:fldCharType="separate"/>
-      </w:r>
-      <w:r>
-        <w:rPr>
-          <w:noProof/>
-          <w:sz w:val="20"/>
-          <w:szCs w:val="20"/>
-        </w:rPr>
-        <w:t>«Kota»</w:t>
-      </w:r>
-      <w:r>
-        <w:rPr>
-          <w:sz w:val="20"/>
-          <w:szCs w:val="20"/>
-        </w:rPr>
-        <w:fldChar w:fldCharType="end"/>
+        <w:t>Cianjur</w:t>
       </w:r>
     </w:p>
     <w:p>
       <w:pPr>
         <w:pStyle w:val="BodyText"/>
         <w:spacing w:before="71"/>
-        <w:ind w:left="51"/>
         <w:rPr>
           <w:sz w:val="20"/>
           <w:szCs w:val="20"/>
@@ -416,39 +352,11 @@
       </w:r>
       <w:r>
         <w:rPr>
-          <w:sz w:val="20"/>
-          <w:szCs w:val="20"/>
-        </w:rPr>
-        <w:fldChar w:fldCharType="begin"/>
-      </w:r>
-      <w:r>
-        <w:rPr>
-          <w:sz w:val="20"/>
-          <w:szCs w:val="20"/>
-        </w:rPr>
-        <w:instrText xml:space="preserve"> MERGEFIELD SPPBJ </w:instrText>
-      </w:r>
-      <w:r>
-        <w:rPr>
-          <w:sz w:val="20"/>
-          <w:szCs w:val="20"/>
-        </w:rPr>
-        <w:fldChar w:fldCharType="separate"/>
-      </w:r>
-      <w:r>
-        <w:rPr>
-          <w:noProof/>
-          <w:sz w:val="20"/>
-          <w:szCs w:val="20"/>
-        </w:rPr>
-        <w:t>«SPPBJ»</w:t>
-      </w:r>
-      <w:r>
-        <w:rPr>
-          <w:sz w:val="20"/>
-          <w:szCs w:val="20"/>
-        </w:rPr>
-        <w:fldChar w:fldCharType="end"/>
+          <w:spacing w:val="1"/>
+          <w:sz w:val="20"/>
+          <w:szCs w:val="20"/>
+        </w:rPr>
+        <w:t>${tgl_sppbj}</w:t>
       </w:r>
     </w:p>
     <w:p>
@@ -607,39 +515,12 @@
       </w:r>
       <w:r>
         <w:rPr>
-          <w:sz w:val="20"/>
-          <w:szCs w:val="20"/>
-        </w:rPr>
-        <w:fldChar w:fldCharType="begin"/>
-      </w:r>
-      <w:r>
-        <w:rPr>
-          <w:sz w:val="20"/>
-          <w:szCs w:val="20"/>
-        </w:rPr>
-        <w:instrText xml:space="preserve"> MERGEFIELD Pekerjaan </w:instrText>
-      </w:r>
-      <w:r>
-        <w:rPr>
-          <w:sz w:val="20"/>
-          <w:szCs w:val="20"/>
-        </w:rPr>
-        <w:fldChar w:fldCharType="separate"/>
-      </w:r>
-      <w:r>
-        <w:rPr>
-          <w:noProof/>
-          <w:sz w:val="20"/>
-          <w:szCs w:val="20"/>
-        </w:rPr>
-        <w:t>«Pekerjaan»</w:t>
-      </w:r>
-      <w:r>
-        <w:rPr>
-          <w:sz w:val="20"/>
-          <w:szCs w:val="20"/>
-        </w:rPr>
-        <w:fldChar w:fldCharType="end"/>
+          <w:b/>
+          <w:bCs/>
+          <w:sz w:val="20"/>
+          <w:szCs w:val="20"/>
+        </w:rPr>
+        <w:t>${nama_paket}</w:t>
       </w:r>
       <w:r>
         <w:rPr>
@@ -747,40 +628,16 @@
         <w:t>Rp.</w:t>
       </w:r>
       <w:r>
-        <w:rPr>
-          <w:sz w:val="20"/>
-          <w:szCs w:val="20"/>
-        </w:rPr>
-        <w:fldChar w:fldCharType="begin"/>
-      </w:r>
-      <w:r>
-        <w:rPr>
-          <w:sz w:val="20"/>
-          <w:szCs w:val="20"/>
-        </w:rPr>
-        <w:instrText xml:space="preserve"> MERGEFIELD Nilai_Kontrak </w:instrText>
-      </w:r>
-      <w:r>
-        <w:rPr>
-          <w:sz w:val="20"/>
-          <w:szCs w:val="20"/>
-        </w:rPr>
-        <w:fldChar w:fldCharType="separate"/>
-      </w:r>
-      <w:r>
-        <w:rPr>
-          <w:noProof/>
-          <w:sz w:val="20"/>
-          <w:szCs w:val="20"/>
-        </w:rPr>
-        <w:t>«Nilai_Kontrak»</w:t>
-      </w:r>
-      <w:r>
-        <w:rPr>
-          <w:sz w:val="20"/>
-          <w:szCs w:val="20"/>
-        </w:rPr>
-        <w:fldChar w:fldCharType="end"/>
+        <w:t xml:space="preserve"> </w:t>
+      </w:r>
+      <w:r>
+        <w:rPr>
+          <w:b/>
+          <w:bCs/>
+          <w:sz w:val="20"/>
+          <w:szCs w:val="20"/>
+        </w:rPr>
+        <w:t>${nilai_kontrak}</w:t>
       </w:r>
       <w:r>
         <w:rPr>
@@ -794,36 +651,7 @@
           <w:sz w:val="20"/>
           <w:szCs w:val="20"/>
         </w:rPr>
-        <w:fldChar w:fldCharType="begin"/>
-      </w:r>
-      <w:r>
-        <w:rPr>
-          <w:sz w:val="20"/>
-          <w:szCs w:val="20"/>
-        </w:rPr>
-        <w:instrText xml:space="preserve"> MERGEFIELD Terbilang </w:instrText>
-      </w:r>
-      <w:r>
-        <w:rPr>
-          <w:sz w:val="20"/>
-          <w:szCs w:val="20"/>
-        </w:rPr>
-        <w:fldChar w:fldCharType="separate"/>
-      </w:r>
-      <w:r>
-        <w:rPr>
-          <w:noProof/>
-          <w:sz w:val="20"/>
-          <w:szCs w:val="20"/>
-        </w:rPr>
-        <w:t>«Terbilang»</w:t>
-      </w:r>
-      <w:r>
-        <w:rPr>
-          <w:sz w:val="20"/>
-          <w:szCs w:val="20"/>
-        </w:rPr>
-        <w:fldChar w:fldCharType="end"/>
+        <w:t>${nilai_kontrak_terbilang}</w:t>
       </w:r>
       <w:r>
         <w:rPr>
@@ -1447,43 +1275,7 @@
           <w:sz w:val="18"/>
           <w:szCs w:val="18"/>
         </w:rPr>
-        <w:fldChar w:fldCharType="begin"/>
-      </w:r>
-      <w:r>
-        <w:rPr>
-          <w:sz w:val="18"/>
-          <w:szCs w:val="18"/>
-        </w:rPr>
-        <w:instrText xml:space="preserve"> MERGEFIELD Pekerjaan </w:instrText>
-      </w:r>
-      <w:r>
-        <w:rPr>
-          <w:sz w:val="18"/>
-          <w:szCs w:val="18"/>
-        </w:rPr>
-        <w:fldChar w:fldCharType="separate"/>
-      </w:r>
-      <w:r>
-        <w:rPr>
-          <w:noProof/>
-          <w:sz w:val="18"/>
-          <w:szCs w:val="18"/>
-        </w:rPr>
-        <w:t>«Pekerjaan»</w:t>
-      </w:r>
-      <w:r>
-        <w:rPr>
-          <w:sz w:val="18"/>
-          <w:szCs w:val="18"/>
-        </w:rPr>
-        <w:fldChar w:fldCharType="end"/>
-      </w:r>
-      <w:r>
-        <w:rPr>
-          <w:sz w:val="18"/>
-          <w:szCs w:val="18"/>
-        </w:rPr>
-        <w:t xml:space="preserve"> </w:t>
+        <w:t>${nama_paket}</w:t>
       </w:r>
       <w:r>
         <w:rPr>
@@ -1512,42 +1304,15 @@
           <w:sz w:val="18"/>
           <w:szCs w:val="18"/>
         </w:rPr>
-        <w:fldChar w:fldCharType="begin"/>
-      </w:r>
-      <w:r>
-        <w:rPr>
-          <w:sz w:val="18"/>
-          <w:szCs w:val="18"/>
-        </w:rPr>
-        <w:instrText xml:space="preserve"> MERGEFIELD SPK1 </w:instrText>
-      </w:r>
-      <w:r>
-        <w:rPr>
-          <w:sz w:val="18"/>
-          <w:szCs w:val="18"/>
-        </w:rPr>
-        <w:fldChar w:fldCharType="separate"/>
-      </w:r>
-      <w:r>
-        <w:rPr>
-          <w:noProof/>
-          <w:sz w:val="18"/>
-          <w:szCs w:val="18"/>
-        </w:rPr>
-        <w:t>«SPK1»</w:t>
-      </w:r>
-      <w:r>
-        <w:rPr>
-          <w:sz w:val="18"/>
-          <w:szCs w:val="18"/>
-        </w:rPr>
-        <w:fldChar w:fldCharType="end"/>
-      </w:r>
-    </w:p>
-    <w:p>
-      <w:pPr>
-        <w:pStyle w:val="BodyText"/>
-        <w:spacing w:before="102"/>
+        <w:t>${nomor_spk}</w:t>
+      </w:r>
+    </w:p>
+    <w:p>
+      <w:pPr>
+        <w:pStyle w:val="BodyText"/>
+        <w:spacing w:before="52"/>
+        <w:ind w:right="23"/>
+        <w:jc w:val="center"/>
         <w:rPr>
           <w:sz w:val="18"/>
           <w:szCs w:val="18"/>
@@ -2069,39 +1834,11 @@
       </w:r>
       <w:r>
         <w:rPr>
-          <w:sz w:val="18"/>
-          <w:szCs w:val="18"/>
-        </w:rPr>
-        <w:fldChar w:fldCharType="begin"/>
-      </w:r>
-      <w:r>
-        <w:rPr>
-          <w:sz w:val="18"/>
-          <w:szCs w:val="18"/>
-        </w:rPr>
-        <w:instrText xml:space="preserve"> MERGEFIELD Pekerjaan </w:instrText>
-      </w:r>
-      <w:r>
-        <w:rPr>
-          <w:sz w:val="18"/>
-          <w:szCs w:val="18"/>
-        </w:rPr>
-        <w:fldChar w:fldCharType="separate"/>
-      </w:r>
-      <w:r>
-        <w:rPr>
-          <w:noProof/>
-          <w:sz w:val="18"/>
-          <w:szCs w:val="18"/>
-        </w:rPr>
-        <w:t>«Pekerjaan»</w:t>
-      </w:r>
-      <w:r>
-        <w:rPr>
-          <w:sz w:val="18"/>
-          <w:szCs w:val="18"/>
-        </w:rPr>
-        <w:fldChar w:fldCharType="end"/>
+          <w:spacing w:val="19"/>
+          <w:sz w:val="18"/>
+          <w:szCs w:val="18"/>
+        </w:rPr>
+        <w:t>${nama_paket}</w:t>
       </w:r>
       <w:r>
         <w:rPr>
@@ -2122,86 +1859,49 @@
           <w:sz w:val="18"/>
           <w:szCs w:val="18"/>
         </w:rPr>
-        <w:fldChar w:fldCharType="begin"/>
-      </w:r>
-      <w:r>
-        <w:rPr>
-          <w:sz w:val="18"/>
-          <w:szCs w:val="18"/>
-        </w:rPr>
-        <w:instrText xml:space="preserve"> MERGEFIELD SPK1 </w:instrText>
-      </w:r>
-      <w:r>
-        <w:rPr>
-          <w:sz w:val="18"/>
-          <w:szCs w:val="18"/>
-        </w:rPr>
-        <w:fldChar w:fldCharType="separate"/>
-      </w:r>
-      <w:r>
-        <w:rPr>
-          <w:noProof/>
-          <w:sz w:val="18"/>
-          <w:szCs w:val="18"/>
-        </w:rPr>
-        <w:t>«SPK1»</w:t>
-      </w:r>
-      <w:r>
-        <w:rPr>
-          <w:sz w:val="18"/>
-          <w:szCs w:val="18"/>
-        </w:rPr>
-        <w:fldChar w:fldCharType="end"/>
-      </w:r>
-      <w:r>
-        <w:rPr>
-          <w:sz w:val="18"/>
-          <w:szCs w:val="18"/>
-        </w:rPr>
-        <w:t xml:space="preserve"> </w:t>
-      </w:r>
-      <w:r>
-        <w:rPr>
-          <w:sz w:val="18"/>
-          <w:szCs w:val="18"/>
-        </w:rPr>
-        <w:t xml:space="preserve">tanggal </w:t>
-      </w:r>
-      <w:r>
-        <w:rPr>
-          <w:sz w:val="18"/>
-          <w:szCs w:val="18"/>
-        </w:rPr>
-        <w:fldChar w:fldCharType="begin"/>
-      </w:r>
-      <w:r>
-        <w:rPr>
-          <w:sz w:val="18"/>
-          <w:szCs w:val="18"/>
-        </w:rPr>
-        <w:instrText xml:space="preserve"> MERGEFIELD SPK </w:instrText>
-      </w:r>
-      <w:r>
-        <w:rPr>
-          <w:sz w:val="18"/>
-          <w:szCs w:val="18"/>
-        </w:rPr>
-        <w:fldChar w:fldCharType="separate"/>
-      </w:r>
-      <w:r>
-        <w:rPr>
-          <w:noProof/>
-          <w:sz w:val="18"/>
-          <w:szCs w:val="18"/>
-        </w:rPr>
-        <w:t>«SPK»</w:t>
-      </w:r>
-      <w:r>
-        <w:rPr>
-          <w:sz w:val="18"/>
-          <w:szCs w:val="18"/>
-        </w:rPr>
-        <w:fldChar w:fldCharType="end"/>
+        <w:t>${</w:t>
+      </w:r>
+      <w:r>
+        <w:rPr>
+          <w:sz w:val="18"/>
+          <w:szCs w:val="18"/>
+        </w:rPr>
+        <w:t>nomor_spk</w:t>
+      </w:r>
+      <w:r>
+        <w:rPr>
+          <w:sz w:val="18"/>
+          <w:szCs w:val="18"/>
+        </w:rPr>
+        <w:t>}</w:t>
+      </w:r>
+      <w:r>
+        <w:rPr>
+          <w:sz w:val="18"/>
+          <w:szCs w:val="18"/>
+        </w:rPr>
+        <w:t xml:space="preserve"> </w:t>
+      </w:r>
+      <w:r>
+        <w:rPr>
+          <w:sz w:val="18"/>
+          <w:szCs w:val="18"/>
+        </w:rPr>
+        <w:t>tanggal</w:t>
+      </w:r>
+      <w:r>
+        <w:rPr>
+          <w:sz w:val="18"/>
+          <w:szCs w:val="18"/>
+        </w:rPr>
+        <w:t xml:space="preserve"> </w:t>
+      </w:r>
+      <w:r>
+        <w:rPr>
+          <w:sz w:val="18"/>
+          <w:szCs w:val="18"/>
+        </w:rPr>
+        <w:t>${tgl_spk}</w:t>
       </w:r>
       <w:r>
         <w:rPr>
@@ -2238,6 +1938,19 @@
           <w:szCs w:val="18"/>
         </w:rPr>
         <w:tab/>
+      </w:r>
+      <w:r>
+        <w:rPr>
+          <w:sz w:val="18"/>
+          <w:szCs w:val="18"/>
+        </w:rPr>
+        <w:tab/>
+      </w:r>
+      <w:r>
+        <w:rPr>
+          <w:sz w:val="18"/>
+          <w:szCs w:val="18"/>
+        </w:rPr>
         <w:t>:</w:t>
       </w:r>
       <w:r>
@@ -2250,44 +1963,11 @@
       </w:r>
       <w:r>
         <w:rPr>
-          <w:b/>
-          <w:sz w:val="18"/>
-          <w:szCs w:val="18"/>
-        </w:rPr>
-        <w:fldChar w:fldCharType="begin"/>
-      </w:r>
-      <w:r>
-        <w:rPr>
-          <w:b/>
-          <w:sz w:val="18"/>
-          <w:szCs w:val="18"/>
-        </w:rPr>
-        <w:instrText xml:space="preserve"> MERGEFIELD Direktur </w:instrText>
-      </w:r>
-      <w:r>
-        <w:rPr>
-          <w:b/>
-          <w:sz w:val="18"/>
-          <w:szCs w:val="18"/>
-        </w:rPr>
-        <w:fldChar w:fldCharType="separate"/>
-      </w:r>
-      <w:r>
-        <w:rPr>
-          <w:b/>
-          <w:noProof/>
-          <w:sz w:val="18"/>
-          <w:szCs w:val="18"/>
-        </w:rPr>
-        <w:t>«Direktur»</w:t>
-      </w:r>
-      <w:r>
-        <w:rPr>
-          <w:b/>
-          <w:sz w:val="18"/>
-          <w:szCs w:val="18"/>
-        </w:rPr>
-        <w:fldChar w:fldCharType="end"/>
+          <w:spacing w:val="37"/>
+          <w:sz w:val="18"/>
+          <w:szCs w:val="18"/>
+        </w:rPr>
+        <w:t>${direktur}</w:t>
       </w:r>
     </w:p>
     <w:p>
@@ -2317,6 +1997,19 @@
           <w:szCs w:val="18"/>
         </w:rPr>
         <w:tab/>
+      </w:r>
+      <w:r>
+        <w:rPr>
+          <w:sz w:val="18"/>
+          <w:szCs w:val="18"/>
+        </w:rPr>
+        <w:tab/>
+      </w:r>
+      <w:r>
+        <w:rPr>
+          <w:sz w:val="18"/>
+          <w:szCs w:val="18"/>
+        </w:rPr>
         <w:t>:</w:t>
       </w:r>
       <w:r>
@@ -2342,6 +2035,8 @@
         <w:spacing w:before="51" w:line="302" w:lineRule="auto"/>
         <w:ind w:left="51" w:right="1857"/>
         <w:rPr>
+          <w:b/>
+          <w:bCs/>
           <w:sz w:val="18"/>
           <w:szCs w:val="18"/>
         </w:rPr>
@@ -2363,6 +2058,14 @@
       </w:r>
       <w:r>
         <w:rPr>
+          <w:spacing w:val="39"/>
+          <w:sz w:val="18"/>
+          <w:szCs w:val="18"/>
+        </w:rPr>
+        <w:tab/>
+      </w:r>
+      <w:r>
+        <w:rPr>
           <w:sz w:val="18"/>
           <w:szCs w:val="18"/>
         </w:rPr>
@@ -2378,46 +2081,11 @@
       </w:r>
       <w:r>
         <w:rPr>
-          <w:sz w:val="18"/>
-          <w:szCs w:val="18"/>
-        </w:rPr>
-        <w:fldChar w:fldCharType="begin"/>
-      </w:r>
-      <w:r>
-        <w:rPr>
-          <w:sz w:val="18"/>
-          <w:szCs w:val="18"/>
-        </w:rPr>
-        <w:instrText xml:space="preserve"> MERGEFIELD Alamat </w:instrText>
-      </w:r>
-      <w:r>
-        <w:rPr>
-          <w:sz w:val="18"/>
-          <w:szCs w:val="18"/>
-        </w:rPr>
-        <w:fldChar w:fldCharType="separate"/>
-      </w:r>
-      <w:r>
-        <w:rPr>
-          <w:noProof/>
-          <w:sz w:val="18"/>
-          <w:szCs w:val="18"/>
-        </w:rPr>
-        <w:t>«Alamat»</w:t>
-      </w:r>
-      <w:r>
-        <w:rPr>
-          <w:sz w:val="18"/>
-          <w:szCs w:val="18"/>
-        </w:rPr>
-        <w:fldChar w:fldCharType="end"/>
-      </w:r>
-      <w:r>
-        <w:rPr>
-          <w:sz w:val="18"/>
-          <w:szCs w:val="18"/>
-        </w:rPr>
-        <w:t xml:space="preserve"> </w:t>
+          <w:spacing w:val="37"/>
+          <w:sz w:val="18"/>
+          <w:szCs w:val="18"/>
+        </w:rPr>
+        <w:t>${alamat_penyedia}</w:t>
       </w:r>
       <w:r>
         <w:rPr>
@@ -2443,6 +2111,14 @@
       </w:r>
       <w:r>
         <w:rPr>
+          <w:spacing w:val="40"/>
+          <w:sz w:val="18"/>
+          <w:szCs w:val="18"/>
+        </w:rPr>
+        <w:tab/>
+      </w:r>
+      <w:r>
+        <w:rPr>
           <w:sz w:val="18"/>
           <w:szCs w:val="18"/>
         </w:rPr>
@@ -2450,47 +2126,80 @@
       </w:r>
       <w:r>
         <w:rPr>
+          <w:sz w:val="18"/>
+          <w:szCs w:val="18"/>
+        </w:rPr>
+        <w:t xml:space="preserve"> </w:t>
+      </w:r>
+      <w:r>
+        <w:rPr>
+          <w:b/>
+          <w:bCs/>
+          <w:sz w:val="18"/>
+          <w:szCs w:val="18"/>
+        </w:rPr>
+        <w:t>${no_akta}</w:t>
+      </w:r>
+    </w:p>
+    <w:p>
+      <w:pPr>
+        <w:pStyle w:val="BodyText"/>
+        <w:spacing w:before="51" w:line="302" w:lineRule="auto"/>
+        <w:ind w:left="51" w:right="1857"/>
+        <w:rPr>
+          <w:b/>
+          <w:bCs/>
           <w:spacing w:val="40"/>
           <w:sz w:val="18"/>
           <w:szCs w:val="18"/>
         </w:rPr>
-        <w:t xml:space="preserve"> </w:t>
-      </w:r>
-      <w:r>
-        <w:rPr>
-          <w:sz w:val="18"/>
-          <w:szCs w:val="18"/>
-        </w:rPr>
-        <w:fldChar w:fldCharType="begin"/>
-      </w:r>
-      <w:r>
-        <w:rPr>
-          <w:sz w:val="18"/>
-          <w:szCs w:val="18"/>
-        </w:rPr>
-        <w:instrText xml:space="preserve"> MERGEFIELD No_Akta </w:instrText>
-      </w:r>
-      <w:r>
-        <w:rPr>
-          <w:sz w:val="18"/>
-          <w:szCs w:val="18"/>
-        </w:rPr>
-        <w:fldChar w:fldCharType="separate"/>
-      </w:r>
-      <w:r>
-        <w:rPr>
-          <w:noProof/>
-          <w:sz w:val="18"/>
-          <w:szCs w:val="18"/>
-        </w:rPr>
-        <w:t>«No_Akta»</w:t>
-      </w:r>
-      <w:r>
-        <w:rPr>
-          <w:sz w:val="18"/>
-          <w:szCs w:val="18"/>
-        </w:rPr>
-        <w:fldChar w:fldCharType="end"/>
+      </w:pPr>
+      <w:r>
+        <w:rPr>
+          <w:spacing w:val="-2"/>
+          <w:sz w:val="18"/>
+          <w:szCs w:val="18"/>
+        </w:rPr>
+        <w:t>Tanggal</w:t>
+      </w:r>
+      <w:r>
+        <w:rPr>
+          <w:sz w:val="18"/>
+          <w:szCs w:val="18"/>
+        </w:rPr>
+        <w:tab/>
+      </w:r>
+      <w:r>
+        <w:rPr>
+          <w:sz w:val="18"/>
+          <w:szCs w:val="18"/>
+        </w:rPr>
+        <w:tab/>
+      </w:r>
+      <w:r>
+        <w:rPr>
+          <w:sz w:val="18"/>
+          <w:szCs w:val="18"/>
+        </w:rPr>
+        <w:t>:</w:t>
+      </w:r>
+      <w:r>
+        <w:rPr>
+          <w:spacing w:val="40"/>
+          <w:sz w:val="18"/>
+          <w:szCs w:val="18"/>
+        </w:rPr>
+        <w:t xml:space="preserve"> </w:t>
+      </w:r>
+      <w:r>
+        <w:rPr>
+          <w:b/>
+          <w:bCs/>
+          <w:spacing w:val="40"/>
+          <w:sz w:val="18"/>
+          <w:szCs w:val="18"/>
+        </w:rPr>
+        <w:t>${tanggal_akta}</w:t>
       </w:r>
     </w:p>
     <w:p>
@@ -2511,7 +2220,7 @@
           <w:sz w:val="18"/>
           <w:szCs w:val="18"/>
         </w:rPr>
-        <w:t>Tanggal</w:t>
+        <w:t>Notaris</w:t>
       </w:r>
       <w:r>
         <w:rPr>
@@ -2519,77 +2228,23 @@
           <w:szCs w:val="18"/>
         </w:rPr>
         <w:tab/>
+      </w:r>
+      <w:r>
+        <w:rPr>
+          <w:sz w:val="18"/>
+          <w:szCs w:val="18"/>
+        </w:rPr>
+        <w:tab/>
+      </w:r>
+      <w:r>
+        <w:rPr>
+          <w:sz w:val="18"/>
+          <w:szCs w:val="18"/>
+        </w:rPr>
         <w:t>:</w:t>
       </w:r>
       <w:r>
         <w:rPr>
-          <w:spacing w:val="40"/>
-          <w:sz w:val="18"/>
-          <w:szCs w:val="18"/>
-        </w:rPr>
-        <w:t xml:space="preserve"> </w:t>
-      </w:r>
-      <w:r>
-        <w:rPr>
-          <w:sz w:val="18"/>
-          <w:szCs w:val="18"/>
-        </w:rPr>
-        <w:fldChar w:fldCharType="begin"/>
-      </w:r>
-      <w:r>
-        <w:rPr>
-          <w:sz w:val="18"/>
-          <w:szCs w:val="18"/>
-        </w:rPr>
-        <w:instrText xml:space="preserve"> MERGEFIELD Tanggal </w:instrText>
-      </w:r>
-      <w:r>
-        <w:rPr>
-          <w:sz w:val="18"/>
-          <w:szCs w:val="18"/>
-        </w:rPr>
-        <w:fldChar w:fldCharType="separate"/>
-      </w:r>
-      <w:r>
-        <w:rPr>
-          <w:noProof/>
-          <w:sz w:val="18"/>
-          <w:szCs w:val="18"/>
-        </w:rPr>
-        <w:t>«Tanggal»</w:t>
-      </w:r>
-      <w:r>
-        <w:rPr>
-          <w:sz w:val="18"/>
-          <w:szCs w:val="18"/>
-        </w:rPr>
-        <w:fldChar w:fldCharType="end"/>
-      </w:r>
-      <w:r>
-        <w:rPr>
-          <w:sz w:val="18"/>
-          <w:szCs w:val="18"/>
-        </w:rPr>
-        <w:br/>
-      </w:r>
-      <w:r>
-        <w:rPr>
-          <w:spacing w:val="-2"/>
-          <w:sz w:val="18"/>
-          <w:szCs w:val="18"/>
-        </w:rPr>
-        <w:t>Notaris</w:t>
-      </w:r>
-      <w:r>
-        <w:rPr>
-          <w:sz w:val="18"/>
-          <w:szCs w:val="18"/>
-        </w:rPr>
-        <w:tab/>
-        <w:t>:</w:t>
-      </w:r>
-      <w:r>
-        <w:rPr>
           <w:spacing w:val="23"/>
           <w:sz w:val="18"/>
           <w:szCs w:val="18"/>
@@ -2598,39 +2253,13 @@
       </w:r>
       <w:r>
         <w:rPr>
-          <w:sz w:val="18"/>
-          <w:szCs w:val="18"/>
-        </w:rPr>
-        <w:fldChar w:fldCharType="begin"/>
-      </w:r>
-      <w:r>
-        <w:rPr>
-          <w:sz w:val="18"/>
-          <w:szCs w:val="18"/>
-        </w:rPr>
-        <w:instrText xml:space="preserve"> MERGEFIELD Notaris </w:instrText>
-      </w:r>
-      <w:r>
-        <w:rPr>
-          <w:sz w:val="18"/>
-          <w:szCs w:val="18"/>
-        </w:rPr>
-        <w:fldChar w:fldCharType="separate"/>
-      </w:r>
-      <w:r>
-        <w:rPr>
-          <w:noProof/>
-          <w:sz w:val="18"/>
-          <w:szCs w:val="18"/>
-        </w:rPr>
-        <w:t>«Notaris»</w:t>
-      </w:r>
-      <w:r>
-        <w:rPr>
-          <w:sz w:val="18"/>
-          <w:szCs w:val="18"/>
-        </w:rPr>
-        <w:fldChar w:fldCharType="end"/>
+          <w:b/>
+          <w:bCs/>
+          <w:spacing w:val="23"/>
+          <w:sz w:val="18"/>
+          <w:szCs w:val="18"/>
+        </w:rPr>
+        <w:t>${notaris}</w:t>
       </w:r>
     </w:p>
     <w:p>
@@ -2776,40 +2405,14 @@
               <w:t>Rp.</w:t>
             </w:r>
             <w:r>
+              <w:t xml:space="preserve"> </w:t>
+            </w:r>
+            <w:r>
               <w:rPr>
                 <w:sz w:val="18"/>
                 <w:szCs w:val="18"/>
               </w:rPr>
-              <w:fldChar w:fldCharType="begin"/>
-            </w:r>
-            <w:r>
-              <w:rPr>
-                <w:sz w:val="18"/>
-                <w:szCs w:val="18"/>
-              </w:rPr>
-              <w:instrText xml:space="preserve"> MERGEFIELD Nilai_Kontrak </w:instrText>
-            </w:r>
-            <w:r>
-              <w:rPr>
-                <w:sz w:val="18"/>
-                <w:szCs w:val="18"/>
-              </w:rPr>
-              <w:fldChar w:fldCharType="separate"/>
-            </w:r>
-            <w:r>
-              <w:rPr>
-                <w:noProof/>
-                <w:sz w:val="18"/>
-                <w:szCs w:val="18"/>
-              </w:rPr>
-              <w:t>«Nilai_Kontrak»</w:t>
-            </w:r>
-            <w:r>
-              <w:rPr>
-                <w:sz w:val="18"/>
-                <w:szCs w:val="18"/>
-              </w:rPr>
-              <w:fldChar w:fldCharType="end"/>
+              <w:t>{nilai_kontrak}</w:t>
             </w:r>
           </w:p>
         </w:tc>
@@ -2945,36 +2548,7 @@
                 <w:sz w:val="18"/>
                 <w:szCs w:val="18"/>
               </w:rPr>
-              <w:fldChar w:fldCharType="begin"/>
-            </w:r>
-            <w:r>
-              <w:rPr>
-                <w:sz w:val="18"/>
-                <w:szCs w:val="18"/>
-              </w:rPr>
-              <w:instrText xml:space="preserve"> MERGEFIELD Mulai </w:instrText>
-            </w:r>
-            <w:r>
-              <w:rPr>
-                <w:sz w:val="18"/>
-                <w:szCs w:val="18"/>
-              </w:rPr>
-              <w:fldChar w:fldCharType="separate"/>
-            </w:r>
-            <w:r>
-              <w:rPr>
-                <w:noProof/>
-                <w:sz w:val="18"/>
-                <w:szCs w:val="18"/>
-              </w:rPr>
-              <w:t>«Mulai»</w:t>
-            </w:r>
-            <w:r>
-              <w:rPr>
-                <w:sz w:val="18"/>
-                <w:szCs w:val="18"/>
-              </w:rPr>
-              <w:fldChar w:fldCharType="end"/>
+              <w:t>${tgl_spmk}</w:t>
             </w:r>
           </w:p>
         </w:tc>
@@ -3317,82 +2891,26 @@
             </w:r>
             <w:r>
               <w:rPr>
+                <w:b/>
+                <w:bCs/>
                 <w:sz w:val="18"/>
                 <w:szCs w:val="18"/>
               </w:rPr>
-              <w:fldChar w:fldCharType="begin"/>
+              <w:t>${masa_hari}</w:t>
             </w:r>
             <w:r>
               <w:rPr>
                 <w:sz w:val="18"/>
                 <w:szCs w:val="18"/>
               </w:rPr>
-              <w:instrText xml:space="preserve"> MERGEFIELD Masa </w:instrText>
+              <w:t xml:space="preserve"> Hari Kalender dan pekerjaan harus sudah selesai pada tanggal </w:t>
             </w:r>
             <w:r>
               <w:rPr>
                 <w:sz w:val="18"/>
                 <w:szCs w:val="18"/>
               </w:rPr>
-              <w:fldChar w:fldCharType="separate"/>
-            </w:r>
-            <w:r>
-              <w:rPr>
-                <w:noProof/>
-                <w:sz w:val="18"/>
-                <w:szCs w:val="18"/>
-              </w:rPr>
-              <w:t>«Masa»</w:t>
-            </w:r>
-            <w:r>
-              <w:rPr>
-                <w:sz w:val="18"/>
-                <w:szCs w:val="18"/>
-              </w:rPr>
-              <w:fldChar w:fldCharType="end"/>
-            </w:r>
-            <w:r>
-              <w:rPr>
-                <w:sz w:val="18"/>
-                <w:szCs w:val="18"/>
-              </w:rPr>
-              <w:t xml:space="preserve"> Hari Kalender dan pekerjaan harus sudah selesai pada tanggal </w:t>
-            </w:r>
-            <w:r>
-              <w:rPr>
-                <w:sz w:val="18"/>
-                <w:szCs w:val="18"/>
-              </w:rPr>
-              <w:fldChar w:fldCharType="begin"/>
-            </w:r>
-            <w:r>
-              <w:rPr>
-                <w:sz w:val="18"/>
-                <w:szCs w:val="18"/>
-              </w:rPr>
-              <w:instrText xml:space="preserve"> MERGEFIELD Selesai </w:instrText>
-            </w:r>
-            <w:r>
-              <w:rPr>
-                <w:sz w:val="18"/>
-                <w:szCs w:val="18"/>
-              </w:rPr>
-              <w:fldChar w:fldCharType="separate"/>
-            </w:r>
-            <w:r>
-              <w:rPr>
-                <w:noProof/>
-                <w:sz w:val="18"/>
-                <w:szCs w:val="18"/>
-              </w:rPr>
-              <w:t>«Selesai»</w:t>
-            </w:r>
-            <w:r>
-              <w:rPr>
-                <w:sz w:val="18"/>
-                <w:szCs w:val="18"/>
-              </w:rPr>
-              <w:fldChar w:fldCharType="end"/>
+              <w:t>${tgl_selesai}</w:t>
             </w:r>
           </w:p>
         </w:tc>
@@ -3521,36 +3039,7 @@
           <w:sz w:val="18"/>
           <w:szCs w:val="18"/>
         </w:rPr>
-        <w:fldChar w:fldCharType="begin"/>
-      </w:r>
-      <w:r>
-        <w:rPr>
-          <w:sz w:val="18"/>
-          <w:szCs w:val="18"/>
-        </w:rPr>
-        <w:instrText xml:space="preserve"> MERGEFIELD SPK </w:instrText>
-      </w:r>
-      <w:r>
-        <w:rPr>
-          <w:sz w:val="18"/>
-          <w:szCs w:val="18"/>
-        </w:rPr>
-        <w:fldChar w:fldCharType="separate"/>
-      </w:r>
-      <w:r>
-        <w:rPr>
-          <w:noProof/>
-          <w:sz w:val="18"/>
-          <w:szCs w:val="18"/>
-        </w:rPr>
-        <w:t>«SPK»</w:t>
-      </w:r>
-      <w:r>
-        <w:rPr>
-          <w:sz w:val="18"/>
-          <w:szCs w:val="18"/>
-        </w:rPr>
-        <w:fldChar w:fldCharType="end"/>
+        <w:t>${tgl_spk}</w:t>
       </w:r>
     </w:p>
     <w:p>
@@ -3767,6 +3256,51 @@
           <w:szCs w:val="18"/>
         </w:rPr>
       </w:pPr>
+    </w:p>
+    <w:p>
+      <w:pPr>
+        <w:pStyle w:val="Heading1"/>
+        <w:spacing w:before="1"/>
+        <w:rPr>
+          <w:spacing w:val="40"/>
+          <w:sz w:val="18"/>
+          <w:szCs w:val="18"/>
+        </w:rPr>
+      </w:pPr>
+      <w:r>
+        <w:rPr>
+          <w:b w:val="0"/>
+          <w:bCs w:val="0"/>
+          <w:sz w:val="18"/>
+          <w:szCs w:val="18"/>
+        </w:rPr>
+        <w:t>Menerima dan menyetujui:</w:t>
+      </w:r>
+      <w:r>
+        <w:rPr>
+          <w:spacing w:val="40"/>
+          <w:sz w:val="18"/>
+          <w:szCs w:val="18"/>
+        </w:rPr>
+        <w:t xml:space="preserve"> </w:t>
+      </w:r>
+    </w:p>
+    <w:p>
+      <w:pPr>
+        <w:pStyle w:val="Heading1"/>
+        <w:spacing w:before="1"/>
+        <w:rPr>
+          <w:sz w:val="20"/>
+          <w:szCs w:val="20"/>
+        </w:rPr>
+      </w:pPr>
+      <w:r>
+        <w:rPr>
+          <w:sz w:val="20"/>
+          <w:szCs w:val="20"/>
+        </w:rPr>
+        <w:t>${nama_penyedia}</w:t>
+      </w:r>
     </w:p>
     <w:p>
       <w:pPr>
@@ -3778,59 +3312,6 @@
           <w:szCs w:val="18"/>
         </w:rPr>
       </w:pPr>
-      <w:r>
-        <w:rPr>
-          <w:b w:val="0"/>
-          <w:bCs w:val="0"/>
-          <w:sz w:val="18"/>
-          <w:szCs w:val="18"/>
-        </w:rPr>
-        <w:t>Menerima dan menyetujui:</w:t>
-      </w:r>
-      <w:r>
-        <w:rPr>
-          <w:spacing w:val="40"/>
-          <w:sz w:val="18"/>
-          <w:szCs w:val="18"/>
-        </w:rPr>
-        <w:t xml:space="preserve"> </w:t>
-      </w:r>
-      <w:r>
-        <w:rPr>
-          <w:sz w:val="18"/>
-          <w:szCs w:val="18"/>
-        </w:rPr>
-        <w:fldChar w:fldCharType="begin"/>
-      </w:r>
-      <w:r>
-        <w:rPr>
-          <w:sz w:val="18"/>
-          <w:szCs w:val="18"/>
-        </w:rPr>
-        <w:instrText xml:space="preserve"> MERGEFIELD Penyedia </w:instrText>
-      </w:r>
-      <w:r>
-        <w:rPr>
-          <w:sz w:val="18"/>
-          <w:szCs w:val="18"/>
-        </w:rPr>
-        <w:fldChar w:fldCharType="separate"/>
-      </w:r>
-      <w:r>
-        <w:rPr>
-          <w:noProof/>
-          <w:sz w:val="18"/>
-          <w:szCs w:val="18"/>
-        </w:rPr>
-        <w:t>«Penyedia»</w:t>
-      </w:r>
-      <w:r>
-        <w:rPr>
-          <w:sz w:val="18"/>
-          <w:szCs w:val="18"/>
-        </w:rPr>
-        <w:fldChar w:fldCharType="end"/>
-      </w:r>
     </w:p>
     <w:p>
       <w:pPr>
@@ -3900,55 +3381,19 @@
       <w:r>
         <w:rPr>
           <w:b/>
+          <w:bCs/>
+          <w:spacing w:val="37"/>
           <w:sz w:val="18"/>
           <w:szCs w:val="18"/>
           <w:u w:val="single"/>
         </w:rPr>
-        <w:fldChar w:fldCharType="begin"/>
-      </w:r>
-      <w:r>
-        <w:rPr>
-          <w:b/>
-          <w:sz w:val="18"/>
-          <w:szCs w:val="18"/>
-          <w:u w:val="single"/>
-        </w:rPr>
-        <w:instrText xml:space="preserve"> MERGEFIELD Direktur </w:instrText>
-      </w:r>
-      <w:r>
-        <w:rPr>
-          <w:b/>
-          <w:sz w:val="18"/>
-          <w:szCs w:val="18"/>
-          <w:u w:val="single"/>
-        </w:rPr>
-        <w:fldChar w:fldCharType="separate"/>
-      </w:r>
-      <w:r>
-        <w:rPr>
-          <w:b/>
-          <w:noProof/>
-          <w:sz w:val="18"/>
-          <w:szCs w:val="18"/>
-          <w:u w:val="single"/>
-        </w:rPr>
-        <w:t>«Direktur»</w:t>
-      </w:r>
-      <w:r>
-        <w:rPr>
-          <w:b/>
-          <w:sz w:val="18"/>
-          <w:szCs w:val="18"/>
-          <w:u w:val="single"/>
-        </w:rPr>
-        <w:fldChar w:fldCharType="end"/>
-      </w:r>
-      <w:r>
-        <w:rPr>
-          <w:b/>
-          <w:sz w:val="18"/>
-          <w:szCs w:val="18"/>
-          <w:u w:val="single"/>
+        <w:t>${direktur}</w:t>
+      </w:r>
+      <w:r>
+        <w:rPr>
+          <w:spacing w:val="37"/>
+          <w:sz w:val="18"/>
+          <w:szCs w:val="18"/>
         </w:rPr>
         <w:br/>
       </w:r>
@@ -4103,36 +3548,7 @@
           <w:sz w:val="20"/>
           <w:szCs w:val="20"/>
         </w:rPr>
-        <w:fldChar w:fldCharType="begin"/>
-      </w:r>
-      <w:r>
-        <w:rPr>
-          <w:sz w:val="20"/>
-          <w:szCs w:val="20"/>
-        </w:rPr>
-        <w:instrText xml:space="preserve"> MERGEFIELD SPMK </w:instrText>
-      </w:r>
-      <w:r>
-        <w:rPr>
-          <w:sz w:val="20"/>
-          <w:szCs w:val="20"/>
-        </w:rPr>
-        <w:fldChar w:fldCharType="separate"/>
-      </w:r>
-      <w:r>
-        <w:rPr>
-          <w:noProof/>
-          <w:sz w:val="20"/>
-          <w:szCs w:val="20"/>
-        </w:rPr>
-        <w:t>«SPMK»</w:t>
-      </w:r>
-      <w:r>
-        <w:rPr>
-          <w:sz w:val="20"/>
-          <w:szCs w:val="20"/>
-        </w:rPr>
-        <w:fldChar w:fldCharType="end"/>
+        <w:t>${nomor_spmk}</w:t>
       </w:r>
     </w:p>
     <w:p>
@@ -4226,42 +3642,15 @@
           <w:sz w:val="20"/>
           <w:szCs w:val="20"/>
         </w:rPr>
-        <w:fldChar w:fldCharType="begin"/>
-      </w:r>
-      <w:r>
-        <w:rPr>
-          <w:sz w:val="20"/>
-          <w:szCs w:val="20"/>
-        </w:rPr>
-        <w:instrText xml:space="preserve"> MERGEFIELD Pekerjaan </w:instrText>
-      </w:r>
-      <w:r>
-        <w:rPr>
-          <w:sz w:val="20"/>
-          <w:szCs w:val="20"/>
-        </w:rPr>
-        <w:fldChar w:fldCharType="separate"/>
-      </w:r>
-      <w:r>
-        <w:rPr>
-          <w:noProof/>
-          <w:sz w:val="20"/>
-          <w:szCs w:val="20"/>
-        </w:rPr>
-        <w:t>«Pekerjaan»</w:t>
-      </w:r>
-      <w:r>
-        <w:rPr>
-          <w:sz w:val="20"/>
-          <w:szCs w:val="20"/>
-        </w:rPr>
-        <w:fldChar w:fldCharType="end"/>
-      </w:r>
-    </w:p>
-    <w:p>
-      <w:pPr>
-        <w:pStyle w:val="BodyText"/>
-        <w:spacing w:before="11"/>
+        <w:t>${nama_paket}</w:t>
+      </w:r>
+    </w:p>
+    <w:p>
+      <w:pPr>
+        <w:pStyle w:val="BodyText"/>
+        <w:spacing w:before="60"/>
+        <w:ind w:right="23"/>
+        <w:jc w:val="center"/>
         <w:rPr>
           <w:sz w:val="20"/>
           <w:szCs w:val="20"/>
@@ -4689,11 +4078,12 @@
     <w:p>
       <w:pPr>
         <w:pStyle w:val="BodyText"/>
-        <w:spacing w:line="244" w:lineRule="auto"/>
-        <w:ind w:left="51" w:right="135"/>
-        <w:rPr>
-          <w:sz w:val="20"/>
-          <w:szCs w:val="20"/>
+        <w:spacing w:before="52"/>
+        <w:ind w:right="23"/>
+        <w:jc w:val="center"/>
+        <w:rPr>
+          <w:sz w:val="18"/>
+          <w:szCs w:val="18"/>
         </w:rPr>
       </w:pPr>
       <w:r>
@@ -4708,6 +4098,76 @@
           <w:sz w:val="20"/>
           <w:szCs w:val="20"/>
         </w:rPr>
+        <w:t>${nama_paket}</w:t>
+      </w:r>
+      <w:r>
+        <w:rPr>
+          <w:sz w:val="20"/>
+          <w:szCs w:val="20"/>
+        </w:rPr>
+        <w:t xml:space="preserve"> </w:t>
+      </w:r>
+      <w:r>
+        <w:rPr>
+          <w:sz w:val="20"/>
+          <w:szCs w:val="20"/>
+        </w:rPr>
+        <w:t>nomor</w:t>
+      </w:r>
+      <w:r>
+        <w:rPr>
+          <w:sz w:val="20"/>
+          <w:szCs w:val="20"/>
+        </w:rPr>
+        <w:t xml:space="preserve">: </w:t>
+      </w:r>
+      <w:r>
+        <w:rPr>
+          <w:sz w:val="18"/>
+          <w:szCs w:val="18"/>
+        </w:rPr>
+        <w:t>${nomor_spk}</w:t>
+      </w:r>
+      <w:r>
+        <w:rPr>
+          <w:sz w:val="18"/>
+          <w:szCs w:val="18"/>
+        </w:rPr>
+        <w:t xml:space="preserve"> </w:t>
+      </w:r>
+      <w:r>
+        <w:rPr>
+          <w:sz w:val="20"/>
+          <w:szCs w:val="20"/>
+        </w:rPr>
+        <w:t xml:space="preserve">tanggal </w:t>
+      </w:r>
+      <w:r>
+        <w:rPr>
+          <w:sz w:val="18"/>
+          <w:szCs w:val="18"/>
+        </w:rPr>
+        <w:t>${</w:t>
+      </w:r>
+      <w:r>
+        <w:rPr>
+          <w:sz w:val="18"/>
+          <w:szCs w:val="18"/>
+        </w:rPr>
+        <w:t>tlg</w:t>
+      </w:r>
+      <w:r>
+        <w:rPr>
+          <w:sz w:val="18"/>
+          <w:szCs w:val="18"/>
+        </w:rPr>
+        <w:t>_spk}</w:t>
+      </w:r>
+      <w:r>
+        <w:rPr>
+          <w:sz w:val="20"/>
+          <w:szCs w:val="20"/>
+        </w:rPr>
         <w:fldChar w:fldCharType="begin"/>
       </w:r>
       <w:r>
@@ -4715,7 +4175,7 @@
           <w:sz w:val="20"/>
           <w:szCs w:val="20"/>
         </w:rPr>
-        <w:instrText xml:space="preserve"> MERGEFIELD Pekerjaan </w:instrText>
+        <w:instrText xml:space="preserve"> MERGEFIELD SPK </w:instrText>
       </w:r>
       <w:r>
         <w:rPr>
@@ -4726,14 +4186,6 @@
       </w:r>
       <w:r>
         <w:rPr>
-          <w:noProof/>
-          <w:sz w:val="20"/>
-          <w:szCs w:val="20"/>
-        </w:rPr>
-        <w:t>«Pekerjaan»</w:t>
-      </w:r>
-      <w:r>
-        <w:rPr>
           <w:sz w:val="20"/>
           <w:szCs w:val="20"/>
         </w:rPr>
@@ -4744,106 +4196,6 @@
           <w:sz w:val="20"/>
           <w:szCs w:val="20"/>
         </w:rPr>
-        <w:t xml:space="preserve"> nomor</w:t>
-      </w:r>
-      <w:r>
-        <w:rPr>
-          <w:sz w:val="20"/>
-          <w:szCs w:val="20"/>
-        </w:rPr>
-        <w:t xml:space="preserve">: </w:t>
-      </w:r>
-      <w:r>
-        <w:rPr>
-          <w:sz w:val="20"/>
-          <w:szCs w:val="20"/>
-        </w:rPr>
-        <w:fldChar w:fldCharType="begin"/>
-      </w:r>
-      <w:r>
-        <w:rPr>
-          <w:sz w:val="20"/>
-          <w:szCs w:val="20"/>
-        </w:rPr>
-        <w:instrText xml:space="preserve"> MERGEFIELD SPK1 </w:instrText>
-      </w:r>
-      <w:r>
-        <w:rPr>
-          <w:sz w:val="20"/>
-          <w:szCs w:val="20"/>
-        </w:rPr>
-        <w:fldChar w:fldCharType="separate"/>
-      </w:r>
-      <w:r>
-        <w:rPr>
-          <w:noProof/>
-          <w:sz w:val="20"/>
-          <w:szCs w:val="20"/>
-        </w:rPr>
-        <w:t>«SPK1»</w:t>
-      </w:r>
-      <w:r>
-        <w:rPr>
-          <w:sz w:val="20"/>
-          <w:szCs w:val="20"/>
-        </w:rPr>
-        <w:fldChar w:fldCharType="end"/>
-      </w:r>
-      <w:r>
-        <w:rPr>
-          <w:sz w:val="20"/>
-          <w:szCs w:val="20"/>
-        </w:rPr>
-        <w:t xml:space="preserve"> </w:t>
-      </w:r>
-      <w:r>
-        <w:rPr>
-          <w:sz w:val="20"/>
-          <w:szCs w:val="20"/>
-        </w:rPr>
-        <w:t xml:space="preserve">tanggal </w:t>
-      </w:r>
-      <w:r>
-        <w:rPr>
-          <w:sz w:val="20"/>
-          <w:szCs w:val="20"/>
-        </w:rPr>
-        <w:fldChar w:fldCharType="begin"/>
-      </w:r>
-      <w:r>
-        <w:rPr>
-          <w:sz w:val="20"/>
-          <w:szCs w:val="20"/>
-        </w:rPr>
-        <w:instrText xml:space="preserve"> MERGEFIELD SPK </w:instrText>
-      </w:r>
-      <w:r>
-        <w:rPr>
-          <w:sz w:val="20"/>
-          <w:szCs w:val="20"/>
-        </w:rPr>
-        <w:fldChar w:fldCharType="separate"/>
-      </w:r>
-      <w:r>
-        <w:rPr>
-          <w:noProof/>
-          <w:sz w:val="20"/>
-          <w:szCs w:val="20"/>
-        </w:rPr>
-        <w:t>«SPK»</w:t>
-      </w:r>
-      <w:r>
-        <w:rPr>
-          <w:sz w:val="20"/>
-          <w:szCs w:val="20"/>
-        </w:rPr>
-        <w:fldChar w:fldCharType="end"/>
-      </w:r>
-      <w:r>
-        <w:rPr>
-          <w:sz w:val="20"/>
-          <w:szCs w:val="20"/>
-        </w:rPr>
         <w:t xml:space="preserve"> </w:t>
       </w:r>
       <w:r>
@@ -4865,178 +4217,70 @@
     </w:p>
     <w:p>
       <w:pPr>
-        <w:pStyle w:val="BodyText"/>
-        <w:spacing w:before="51"/>
-        <w:ind w:left="51"/>
+        <w:pStyle w:val="Heading1"/>
+        <w:spacing w:before="1"/>
+        <w:rPr>
+          <w:sz w:val="20"/>
+          <w:szCs w:val="20"/>
+        </w:rPr>
+      </w:pPr>
+      <w:r>
+        <w:rPr>
+          <w:sz w:val="20"/>
+          <w:szCs w:val="20"/>
+        </w:rPr>
+        <w:t>${nama_penyedia}</w:t>
+      </w:r>
+      <w:r>
+        <w:rPr>
+          <w:spacing w:val="-2"/>
+          <w:sz w:val="20"/>
+          <w:szCs w:val="20"/>
+        </w:rPr>
+        <w:t xml:space="preserve"> </w:t>
+      </w:r>
+    </w:p>
+    <w:p>
+      <w:pPr>
+        <w:pStyle w:val="BodyText"/>
+        <w:spacing w:before="52" w:line="302" w:lineRule="auto"/>
+        <w:ind w:left="51" w:right="-411"/>
+        <w:rPr>
+          <w:sz w:val="20"/>
+          <w:szCs w:val="20"/>
+        </w:rPr>
+      </w:pPr>
+      <w:r>
+        <w:rPr>
+          <w:spacing w:val="37"/>
+          <w:sz w:val="18"/>
+          <w:szCs w:val="18"/>
+        </w:rPr>
+        <w:t>${alamat_penyedia}</w:t>
+      </w:r>
+      <w:r>
+        <w:rPr>
+          <w:sz w:val="18"/>
+          <w:szCs w:val="18"/>
+        </w:rPr>
+        <w:br/>
+      </w:r>
+      <w:r>
+        <w:rPr>
+          <w:sz w:val="20"/>
+          <w:szCs w:val="20"/>
+        </w:rPr>
+        <w:t xml:space="preserve">yang dalam hal ini diwakili oleh </w:t>
+      </w:r>
+      <w:r>
         <w:rPr>
           <w:b/>
           <w:bCs/>
-          <w:spacing w:val="-2"/>
-          <w:sz w:val="20"/>
-          <w:szCs w:val="20"/>
-        </w:rPr>
-      </w:pPr>
-      <w:r>
-        <w:rPr>
-          <w:b/>
-          <w:bCs/>
-          <w:spacing w:val="-2"/>
-          <w:sz w:val="20"/>
-          <w:szCs w:val="20"/>
-        </w:rPr>
-        <w:fldChar w:fldCharType="begin"/>
-      </w:r>
-      <w:r>
-        <w:rPr>
-          <w:b/>
-          <w:bCs/>
-          <w:spacing w:val="-2"/>
-          <w:sz w:val="20"/>
-          <w:szCs w:val="20"/>
-        </w:rPr>
-        <w:instrText xml:space="preserve"> MERGEFIELD Penyedia </w:instrText>
-      </w:r>
-      <w:r>
-        <w:rPr>
-          <w:b/>
-          <w:bCs/>
-          <w:spacing w:val="-2"/>
-          <w:sz w:val="20"/>
-          <w:szCs w:val="20"/>
-        </w:rPr>
-        <w:fldChar w:fldCharType="separate"/>
-      </w:r>
-      <w:r>
-        <w:rPr>
-          <w:b/>
-          <w:bCs/>
-          <w:noProof/>
-          <w:spacing w:val="-2"/>
-          <w:sz w:val="20"/>
-          <w:szCs w:val="20"/>
-        </w:rPr>
-        <w:t>«Penyedia»</w:t>
-      </w:r>
-      <w:r>
-        <w:rPr>
-          <w:b/>
-          <w:bCs/>
-          <w:spacing w:val="-2"/>
-          <w:sz w:val="20"/>
-          <w:szCs w:val="20"/>
-        </w:rPr>
-        <w:fldChar w:fldCharType="end"/>
-      </w:r>
-      <w:r>
-        <w:rPr>
-          <w:b/>
-          <w:bCs/>
-          <w:spacing w:val="-2"/>
-          <w:sz w:val="20"/>
-          <w:szCs w:val="20"/>
-        </w:rPr>
-        <w:t xml:space="preserve"> </w:t>
-      </w:r>
-    </w:p>
-    <w:p>
-      <w:pPr>
-        <w:pStyle w:val="BodyText"/>
-        <w:spacing w:before="52" w:line="302" w:lineRule="auto"/>
-        <w:ind w:left="51" w:right="-411"/>
-        <w:rPr>
-          <w:sz w:val="20"/>
-          <w:szCs w:val="20"/>
-        </w:rPr>
-      </w:pPr>
-      <w:r>
-        <w:rPr>
-          <w:sz w:val="20"/>
-          <w:szCs w:val="20"/>
-        </w:rPr>
-        <w:fldChar w:fldCharType="begin"/>
-      </w:r>
-      <w:r>
-        <w:rPr>
-          <w:sz w:val="20"/>
-          <w:szCs w:val="20"/>
-        </w:rPr>
-        <w:instrText xml:space="preserve"> MERGEFIELD Alamat </w:instrText>
-      </w:r>
-      <w:r>
-        <w:rPr>
-          <w:sz w:val="20"/>
-          <w:szCs w:val="20"/>
-        </w:rPr>
-        <w:fldChar w:fldCharType="separate"/>
-      </w:r>
-      <w:r>
-        <w:rPr>
-          <w:noProof/>
-          <w:sz w:val="20"/>
-          <w:szCs w:val="20"/>
-        </w:rPr>
-        <w:t>«Alamat»</w:t>
-      </w:r>
-      <w:r>
-        <w:rPr>
-          <w:sz w:val="20"/>
-          <w:szCs w:val="20"/>
-        </w:rPr>
-        <w:fldChar w:fldCharType="end"/>
-      </w:r>
-    </w:p>
-    <w:p>
-      <w:pPr>
-        <w:pStyle w:val="BodyText"/>
-        <w:spacing w:before="52" w:line="302" w:lineRule="auto"/>
-        <w:ind w:left="51" w:right="-411"/>
-        <w:rPr>
-          <w:sz w:val="20"/>
-          <w:szCs w:val="20"/>
-        </w:rPr>
-      </w:pPr>
-      <w:r>
-        <w:rPr>
-          <w:sz w:val="20"/>
-          <w:szCs w:val="20"/>
-        </w:rPr>
-        <w:t xml:space="preserve">yang dalam hal ini diwakili oleh </w:t>
-      </w:r>
-      <w:r>
-        <w:rPr>
-          <w:sz w:val="20"/>
-          <w:szCs w:val="20"/>
-        </w:rPr>
-        <w:fldChar w:fldCharType="begin"/>
-      </w:r>
-      <w:r>
-        <w:rPr>
-          <w:sz w:val="20"/>
-          <w:szCs w:val="20"/>
-        </w:rPr>
-        <w:instrText xml:space="preserve"> MERGEFIELD Direktur </w:instrText>
-      </w:r>
-      <w:r>
-        <w:rPr>
-          <w:sz w:val="20"/>
-          <w:szCs w:val="20"/>
-        </w:rPr>
-        <w:fldChar w:fldCharType="separate"/>
-      </w:r>
-      <w:r>
-        <w:rPr>
-          <w:noProof/>
-          <w:sz w:val="20"/>
-          <w:szCs w:val="20"/>
-        </w:rPr>
-        <w:t>«Direktur»</w:t>
-      </w:r>
-      <w:r>
-        <w:rPr>
-          <w:sz w:val="20"/>
-          <w:szCs w:val="20"/>
-        </w:rPr>
-        <w:fldChar w:fldCharType="end"/>
+          <w:spacing w:val="37"/>
+          <w:sz w:val="18"/>
+          <w:szCs w:val="18"/>
+        </w:rPr>
+        <w:t>${direktur}</w:t>
       </w:r>
       <w:r>
         <w:rPr>
@@ -5691,82 +4935,49 @@
             </w:r>
             <w:r>
               <w:rPr>
+                <w:b/>
+                <w:bCs/>
                 <w:sz w:val="20"/>
                 <w:szCs w:val="20"/>
               </w:rPr>
-              <w:fldChar w:fldCharType="begin"/>
-            </w:r>
-            <w:r>
-              <w:rPr>
+              <w:t>${masa_hari}</w:t>
+            </w:r>
+            <w:r>
+              <w:rPr>
+                <w:b/>
+                <w:bCs/>
                 <w:sz w:val="20"/>
                 <w:szCs w:val="20"/>
               </w:rPr>
-              <w:instrText xml:space="preserve"> MERGEFIELD Masa </w:instrText>
+              <w:t xml:space="preserve"> </w:t>
             </w:r>
             <w:r>
               <w:rPr>
                 <w:sz w:val="20"/>
                 <w:szCs w:val="20"/>
               </w:rPr>
-              <w:fldChar w:fldCharType="separate"/>
-            </w:r>
-            <w:r>
-              <w:rPr>
-                <w:noProof/>
+              <w:t xml:space="preserve">Hari Kalender dan pekerjaan harus sudah selesai pada tanggal </w:t>
+            </w:r>
+            <w:r>
+              <w:rPr>
                 <w:sz w:val="20"/>
                 <w:szCs w:val="20"/>
               </w:rPr>
-              <w:t>«Masa»</w:t>
+              <w:t>${tgl_</w:t>
             </w:r>
             <w:r>
               <w:rPr>
                 <w:sz w:val="20"/>
                 <w:szCs w:val="20"/>
               </w:rPr>
-              <w:fldChar w:fldCharType="end"/>
+              <w:t>selesai</w:t>
             </w:r>
             <w:r>
               <w:rPr>
                 <w:sz w:val="20"/>
                 <w:szCs w:val="20"/>
               </w:rPr>
-              <w:t xml:space="preserve"> Hari Kalender dan pekerjaan harus sudah selesai pada tanggal </w:t>
-            </w:r>
-            <w:r>
-              <w:rPr>
-                <w:sz w:val="20"/>
-                <w:szCs w:val="20"/>
-              </w:rPr>
-              <w:fldChar w:fldCharType="begin"/>
-            </w:r>
-            <w:r>
-              <w:rPr>
-                <w:sz w:val="20"/>
-                <w:szCs w:val="20"/>
-              </w:rPr>
-              <w:instrText xml:space="preserve"> MERGEFIELD Selesai </w:instrText>
-            </w:r>
-            <w:r>
-              <w:rPr>
-                <w:sz w:val="20"/>
-                <w:szCs w:val="20"/>
-              </w:rPr>
-              <w:fldChar w:fldCharType="separate"/>
-            </w:r>
-            <w:r>
-              <w:rPr>
-                <w:noProof/>
-                <w:sz w:val="20"/>
-                <w:szCs w:val="20"/>
-              </w:rPr>
-              <w:t>«Selesai»</w:t>
-            </w:r>
-            <w:r>
-              <w:rPr>
-                <w:sz w:val="20"/>
-                <w:szCs w:val="20"/>
-              </w:rPr>
-              <w:fldChar w:fldCharType="end"/>
+              <w:t>}</w:t>
             </w:r>
           </w:p>
         </w:tc>
@@ -5913,43 +5124,13 @@
           <w:sz w:val="20"/>
           <w:szCs w:val="20"/>
         </w:rPr>
-        <w:fldChar w:fldCharType="begin"/>
-      </w:r>
-      <w:r>
-        <w:rPr>
-          <w:sz w:val="20"/>
-          <w:szCs w:val="20"/>
-        </w:rPr>
-        <w:instrText xml:space="preserve"> MERGEFIELD Mulai </w:instrText>
-      </w:r>
-      <w:r>
-        <w:rPr>
-          <w:sz w:val="20"/>
-          <w:szCs w:val="20"/>
-        </w:rPr>
-        <w:fldChar w:fldCharType="separate"/>
-      </w:r>
-      <w:r>
-        <w:rPr>
-          <w:noProof/>
-          <w:sz w:val="20"/>
-          <w:szCs w:val="20"/>
-        </w:rPr>
-        <w:t>«Mulai»</w:t>
-      </w:r>
-      <w:r>
-        <w:rPr>
-          <w:sz w:val="20"/>
-          <w:szCs w:val="20"/>
-        </w:rPr>
-        <w:fldChar w:fldCharType="end"/>
-      </w:r>
-    </w:p>
-    <w:p>
-      <w:pPr>
-        <w:pStyle w:val="BodyText"/>
-        <w:spacing w:before="51" w:line="302" w:lineRule="auto"/>
-        <w:ind w:left="51" w:right="3558"/>
+        <w:t>${tgl_spmk}</w:t>
+      </w:r>
+    </w:p>
+    <w:p>
+      <w:pPr>
+        <w:pStyle w:val="BodyText"/>
+        <w:ind w:left="51"/>
         <w:rPr>
           <w:sz w:val="20"/>
           <w:szCs w:val="20"/>
@@ -5969,6 +5150,14 @@
           <w:szCs w:val="20"/>
         </w:rPr>
         <w:t xml:space="preserve"> </w:t>
+      </w:r>
+      <w:r>
+        <w:rPr>
+          <w:spacing w:val="40"/>
+          <w:sz w:val="20"/>
+          <w:szCs w:val="20"/>
+        </w:rPr>
+        <w:br/>
       </w:r>
       <w:r>
         <w:rPr>
@@ -6137,6 +5326,7 @@
         <w:spacing w:before="1" w:line="302" w:lineRule="auto"/>
         <w:ind w:right="7244"/>
         <w:rPr>
+          <w:spacing w:val="40"/>
           <w:sz w:val="20"/>
           <w:szCs w:val="20"/>
         </w:rPr>
@@ -6165,6 +5355,23 @@
         </w:rPr>
         <w:t xml:space="preserve"> </w:t>
       </w:r>
+    </w:p>
+    <w:p>
+      <w:pPr>
+        <w:pStyle w:val="Heading1"/>
+        <w:spacing w:before="1"/>
+        <w:rPr>
+          <w:sz w:val="20"/>
+          <w:szCs w:val="20"/>
+        </w:rPr>
+      </w:pPr>
+      <w:r>
+        <w:rPr>
+          <w:sz w:val="20"/>
+          <w:szCs w:val="20"/>
+        </w:rPr>
+        <w:t>${nama_penyedia}</w:t>
+      </w:r>
       <w:r>
         <w:rPr>
           <w:sz w:val="20"/>
@@ -6188,19 +5395,18 @@
       </w:r>
       <w:r>
         <w:rPr>
-          <w:noProof/>
-          <w:sz w:val="20"/>
-          <w:szCs w:val="20"/>
-        </w:rPr>
-        <w:t>«Penyedia»</w:t>
-      </w:r>
-      <w:r>
-        <w:rPr>
           <w:sz w:val="20"/>
           <w:szCs w:val="20"/>
         </w:rPr>
         <w:fldChar w:fldCharType="end"/>
       </w:r>
+      <w:r>
+        <w:rPr>
+          <w:sz w:val="20"/>
+          <w:szCs w:val="20"/>
+        </w:rPr>
+        <w:t xml:space="preserve"> </w:t>
+      </w:r>
     </w:p>
     <w:p>
       <w:pPr>
@@ -6245,71 +5451,33 @@
     </w:p>
     <w:p>
       <w:pPr>
-        <w:pStyle w:val="BodyText"/>
-        <w:spacing w:before="51"/>
-        <w:ind w:left="51"/>
-        <w:rPr>
-          <w:sz w:val="20"/>
-          <w:szCs w:val="20"/>
-        </w:rPr>
-      </w:pPr>
-      <w:r>
-        <w:rPr>
-          <w:b/>
+        <w:pStyle w:val="Heading1"/>
+        <w:spacing w:before="1"/>
+        <w:rPr>
+          <w:sz w:val="20"/>
+          <w:szCs w:val="20"/>
+        </w:rPr>
+      </w:pPr>
+      <w:r>
+        <w:rPr>
           <w:sz w:val="20"/>
           <w:szCs w:val="20"/>
           <w:u w:val="single"/>
         </w:rPr>
-        <w:fldChar w:fldCharType="begin"/>
-      </w:r>
-      <w:r>
-        <w:rPr>
-          <w:b/>
+        <w:t>${direktur}</w:t>
+      </w:r>
+      <w:r>
+        <w:rPr>
           <w:sz w:val="20"/>
           <w:szCs w:val="20"/>
           <w:u w:val="single"/>
         </w:rPr>
-        <w:instrText xml:space="preserve"> MERGEFIELD Direktur </w:instrText>
-      </w:r>
-      <w:r>
-        <w:rPr>
-          <w:b/>
-          <w:sz w:val="20"/>
-          <w:szCs w:val="20"/>
-          <w:u w:val="single"/>
-        </w:rPr>
-        <w:fldChar w:fldCharType="separate"/>
-      </w:r>
-      <w:r>
-        <w:rPr>
-          <w:b/>
-          <w:noProof/>
-          <w:sz w:val="20"/>
-          <w:szCs w:val="20"/>
-          <w:u w:val="single"/>
-        </w:rPr>
-        <w:t>«Direktur»</w:t>
-      </w:r>
-      <w:r>
-        <w:rPr>
-          <w:b/>
-          <w:sz w:val="20"/>
-          <w:szCs w:val="20"/>
-          <w:u w:val="single"/>
-        </w:rPr>
-        <w:fldChar w:fldCharType="end"/>
-      </w:r>
-      <w:r>
-        <w:rPr>
-          <w:b/>
-          <w:sz w:val="20"/>
-          <w:szCs w:val="20"/>
-          <w:u w:val="single"/>
-        </w:rPr>
         <w:br/>
       </w:r>
       <w:r>
         <w:rPr>
+          <w:b w:val="0"/>
+          <w:bCs w:val="0"/>
           <w:spacing w:val="-2"/>
           <w:sz w:val="20"/>
           <w:szCs w:val="20"/>
@@ -7500,6 +6668,7 @@
   <w:style w:type="paragraph" w:styleId="Heading1">
     <w:name w:val="heading 1"/>
     <w:basedOn w:val="Normal"/>
+    <w:link w:val="Heading1Char"/>
     <w:uiPriority w:val="9"/>
     <w:qFormat/>
     <w:pPr>
@@ -7516,7 +6685,6 @@
   <w:style w:type="character" w:default="1" w:styleId="DefaultParagraphFont">
     <w:name w:val="Default Paragraph Font"/>
     <w:uiPriority w:val="1"/>
-    <w:semiHidden/>
     <w:unhideWhenUsed/>
   </w:style>
   <w:style w:type="table" w:default="1" w:styleId="TableNormal">
@@ -7644,6 +6812,21 @@
     <w:rsid w:val="00F22022"/>
     <w:rPr>
       <w:rFonts w:ascii="Calibri" w:eastAsia="Calibri" w:hAnsi="Calibri" w:cs="Calibri"/>
+      <w:sz w:val="16"/>
+      <w:szCs w:val="16"/>
+      <w:lang w:val="id"/>
+    </w:rPr>
+  </w:style>
+  <w:style w:type="character" w:customStyle="1" w:styleId="Heading1Char">
+    <w:name w:val="Heading 1 Char"/>
+    <w:basedOn w:val="DefaultParagraphFont"/>
+    <w:link w:val="Heading1"/>
+    <w:uiPriority w:val="9"/>
+    <w:rsid w:val="00541393"/>
+    <w:rPr>
+      <w:rFonts w:ascii="Calibri" w:eastAsia="Calibri" w:hAnsi="Calibri" w:cs="Calibri"/>
+      <w:b/>
+      <w:bCs/>
       <w:sz w:val="16"/>
       <w:szCs w:val="16"/>
       <w:lang w:val="id"/>

</xml_diff>